<commit_message>
Cards on file, delinquent plans and an admin Plans tab
- Restaurants keep cards on file and choose a default; auto-renewal charges the default card.
  Plans are paid with a saved or new card; the last card of a renewing plan can't be removed.
- A declined payment makes the plan delinquent at once: offers are paused and posting is blocked
  until a payment succeeds (Pay now, daily automatic retry for 7 days, never lapses by itself).
- Owner console Plans tab: change subscription fees and founding spots any time, MRR and plan
  list with delinquent restaurants first, and Charge default card.
- Restaurant Partner Agreement v2026-10-07.1 and the proposal describe delinquency.

Co-Authored-By: Claude Opus 5.5 <noreply@anthropic.com>
Claude-Session: https://claude.ai/code/session_01TTXERQ5iqw3mLUpLGAhJam
</commit_message>
<xml_diff>
--- a/docs/business/Bite-Wise-Restaurant-Partnership-Proposal.docx
+++ b/docs/business/Bite-Wise-Restaurant-Partnership-Proposal.docx
@@ -2651,7 +2651,7 @@
                 <w:rFonts w:ascii="Arial" w:cs="Arial" w:eastAsia="Arial" w:hAnsi="Arial"/>
                 <w:color w:val="1E293B"/>
               </w:rPr>
-              <w:t xml:space="preserve">Card, charged monthly in advance</w:t>
+              <w:t xml:space="preserve">Card on file, charged monthly in advance</w:t>
             </w:r>
           </w:p>
         </w:tc>
@@ -2681,7 +2681,7 @@
                 <w:rFonts w:ascii="Arial" w:cs="Arial" w:eastAsia="Arial" w:hAnsi="Arial"/>
                 <w:color w:val="1E293B"/>
               </w:rPr>
-              <w:t xml:space="preserve">Card, charged yearly in advance</w:t>
+              <w:t xml:space="preserve">Card on file, charged yearly in advance</w:t>
             </w:r>
           </w:p>
         </w:tc>
@@ -3004,7 +3004,7 @@
         <w:rPr>
           <w:rFonts w:ascii="Arial" w:cs="Arial" w:eastAsia="Arial" w:hAnsi="Arial"/>
         </w:rPr>
-        <w:t xml:space="preserve">at the end of each period, to the card on file, so your listings never stop unexpectedly. You get an emailed receipt with an invoice number every time.</w:t>
+        <w:t xml:space="preserve">at the end of each period, charged to your default card on file, so your listings never stop unexpectedly. You get an emailed receipt with an invoice number every time.</w:t>
       </w:r>
     </w:p>
     <w:p>
@@ -3028,7 +3028,7 @@
         <w:rPr>
           <w:rFonts w:ascii="Arial" w:cs="Arial" w:eastAsia="Arial" w:hAnsi="Arial"/>
         </w:rPr>
-        <w:t xml:space="preserve">Turn auto-renewal off at any time from the Plan tab of your dashboard; your plan then simply ends on the last day you have paid for. You can also change your card, or switch between monthly and annual from your next renewal.</w:t>
+        <w:t xml:space="preserve">Turn auto-renewal off at any time from the Plan tab of your dashboard; your plan then simply ends on the last day you have paid for. Keep as many cards on file as you like and choose your default, or switch between monthly and annual from your next renewal.</w:t>
       </w:r>
     </w:p>
     <w:p>
@@ -3070,13 +3070,13 @@
           <w:b/>
           <w:bCs/>
         </w:rPr>
-        <w:t xml:space="preserve">If a payment fails, </w:t>
-      </w:r>
-      <w:r>
-        <w:rPr>
-          <w:rFonts w:ascii="Arial" w:cs="Arial" w:eastAsia="Arial" w:hAnsi="Arial"/>
-        </w:rPr>
-        <w:t xml:space="preserve">we email you and retry daily. You keep a 7-day grace period to update your card before your offers are paused.</w:t>
+        <w:t xml:space="preserve">If a payment is declined, </w:t>
+      </w:r>
+      <w:r>
+        <w:rPr>
+          <w:rFonts w:ascii="Arial" w:cs="Arial" w:eastAsia="Arial" w:hAnsi="Arial"/>
+        </w:rPr>
+        <w:t xml:space="preserve">your plan becomes delinquent straight away: your offers are paused and you can't post until a payment goes through. We email you and retry your default card automatically, and you can pay at any time from the Plan tab with any card.</w:t>
       </w:r>
     </w:p>
     <w:p>

</xml_diff>